<commit_message>
ADG: 9장 보강 — 옵션 없는 대안 경로(MOUNTED Standby)
실습 주제 목록 9장 7번을 실측해 반영한다. 계획 미이행 항목은 0 개가 되었다.

- 본문에 9.8 "옵션이 없다면 — MOUNTED 로 두고 확인한다" 신설
  (요약 → 9.9, 퀴즈 → 9.10, 실습 개요 → 9.11)
- 실습 08 트랜스크립트 추가
- 객관식 [상-10] 교체, 서술형 [추가-19] 를 MOUNTED 사례까지 확장
- PPT 35 → 38장
- 9.7.1 이 @H2 로 잘못 달려 있던 것을 @H3 으로 수정

주요 실측
- Primary 의 V$DATAGUARD_STATS 는 0행이다.
  계획서의 "Primary 에서 V$DATAGUARD_STATS 로 확인" 은 성립하지 않는다
- MOUNTED 로 내려도 MRP0 은 APPLYING_LOG, 실시간 적용도 유지된다
- 사용자 표 조회는 ORA-01219, 고정 뷰는 그대로 조회된다
  → MOUNTED Standby 에서 두 지연을 그대로 잴 수 있다
- PDB 서비스가 사라져 ORA-12514 (리스너 부재의 ORA-12541 과 구별)
- Primary 쪽 표식은 DATABASE_MODE(OPEN_READ-ONLY ↔ MOUNTED-STANDBY)와
  RECOVERY_MODE 의 WITH QUERY 유무. APPLIED_SEQ# 는 닫은 뒤에도 올라간다
- Broker 의 Real Time Query 는 OFF 가 되지만 구성은 SUCCESS
- V$ARCHIVED_LOG 의 max(sequence#) 는 RESETLOGS 이전 번호를 집는다
  (실측 94, 그때 현재 시퀀스 12)

본문 29,946자, verify 21/21. 환경은 READ ONLY WITH APPLY 로 원복 확인.

Co-Authored-By: Claude Opus 5 (1M context) <noreply@anthropic.com>
</commit_message>
<xml_diff>
--- a/ADG/09장/9장_ActiveDataGuard_실시간조회와DML리다이렉션.docx
+++ b/ADG/09장/9장_ActiveDataGuard_실시간조회와DML리다이렉션.docx
@@ -149,6 +149,18 @@
     </w:p>
     <w:p>
       <w:pPr>
+        <w:pStyle w:val="ListBullet"/>
+      </w:pPr>
+      <w:r>
+        <w:rPr>
+          <w:rFonts w:ascii="맑은 고딕" w:hAnsi="맑은 고딕" w:eastAsia="맑은 고딕"/>
+          <w:sz w:val="21"/>
+        </w:rPr>
+        <w:t>옵션 없이 운영할 때 Standby를 MOUNTED로 두고 동기화를 확인하는 방법을 제시한다.</w:t>
+      </w:r>
+    </w:p>
+    <w:p>
+      <w:pPr>
         <w:pStyle w:val="Heading2"/>
       </w:pPr>
       <w:r>
@@ -944,7 +956,7 @@
           <w:rFonts w:ascii="맑은 고딕" w:hAnsi="맑은 고딕" w:eastAsia="맑은 고딕"/>
           <w:sz w:val="21"/>
         </w:rPr>
-        <w:t>답은 **보이지 않는다**이다. 리두는 커밋 전에도 전송·적용되지만, 조회는 커밋된 데이터만 본다. Primary에서와 같은 읽기 일관성 규칙이 적용된다.</w:t>
+        <w:t>답은 **보이지 않는다**이다. 리두는 커밋 전에도 전송·적용되지만 조회는 커밋된 데이터만 본다.</w:t>
       </w:r>
     </w:p>
     <w:p>
@@ -953,7 +965,7 @@
           <w:rFonts w:ascii="맑은 고딕" w:hAnsi="맑은 고딕" w:eastAsia="맑은 고딕"/>
           <w:sz w:val="21"/>
         </w:rPr>
-        <w:t>실측 절차는 이렇다. Primary에서 백그라운드 세션이 `INSERT` 후 40초 동안 커밋하지 않고 기다리게 하고, 그 사이 Standby에서 조회했다.</w:t>
+        <w:t>Primary의 백그라운드 세션이 `INSERT` 후 40초 동안 커밋하지 않고 기다리는 사이 Standby에서 조회했다.</w:t>
       </w:r>
     </w:p>
     <w:tbl>
@@ -1165,7 +1177,7 @@
           <w:rFonts w:ascii="맑은 고딕" w:hAnsi="맑은 고딕" w:eastAsia="맑은 고딕"/>
           <w:sz w:val="21"/>
         </w:rPr>
-        <w:t>이것이 중요한 이유가 있다. Standby는 **리두를 적용하는 중**이므로 데이터 블록에는 커밋되지 않은 변경이 이미 반영되어 있을 수 있다. 그럼에도 조회 결과가 깨끗한 것은 UNDO 정보 역시 함께 적용되어 읽기 일관성이 유지되기 때문이다. Standby 조회는 Primary 조회와 같은 규칙을 따른다.</w:t>
+        <w:t>Standby는 **리두를 적용하는 중**이므로 데이터 블록에는 커밋되지 않은 변경이 이미 반영되어 있을 수 있다. 그럼에도 결과가 깨끗한 것은 UNDO 도 함께 적용되어 읽기 일관성이 유지되기 때문이다.</w:t>
       </w:r>
     </w:p>
     <w:p>
@@ -1457,7 +1469,7 @@
                 <w:rFonts w:ascii="맑은 고딕" w:hAnsi="맑은 고딕" w:eastAsia="맑은 고딕"/>
                 <w:sz w:val="20"/>
               </w:rPr>
-              <w:t>이 사례가 주는 교훈은 Data Guard 지식이 아니라 **측정 방법**에 관한 것이다.</w:t>
+              <w:t>이 사례의 교훈은 Data Guard 지식이 아니라 **측정 방법**에 관한 것이다. 커밋되지 않은 상태를 유지하려면 세션이 살아 있어야 하며, SQL*Plus는 `EXIT`에서 커밋하고 비정상 종료에서는 롤백한다.</w:t>
             </w:r>
           </w:p>
           <w:p>
@@ -1469,19 +1481,7 @@
                 <w:rFonts w:ascii="맑은 고딕" w:hAnsi="맑은 고딕" w:eastAsia="맑은 고딕"/>
                 <w:sz w:val="20"/>
               </w:rPr>
-              <w:t>커밋되지 않은 상태를 유지하려면 세션이 살아 있어야 한다. 도구가 세션을 닫으면서 무엇을 하는지 알아야 한다. SQL*Plus는 `EXIT`에서 커밋하고, 비정상 종료에서는 롤백한다.</w:t>
-            </w:r>
-          </w:p>
-          <w:p>
-            <w:pPr>
-              <w:spacing w:after="20"/>
-            </w:pPr>
-            <w:r>
-              <w:rPr>
-                <w:rFonts w:ascii="맑은 고딕" w:hAnsi="맑은 고딕" w:eastAsia="맑은 고딕"/>
-                <w:sz w:val="20"/>
-              </w:rPr>
-              <w:t>확실한 방법은 하나의 세션 안에서 `INSERT` → 대기 → 확인을 모두 처리하는 것이다. 실측에서는 `DBMS_SESSION.SLEEP(40)`으로 세션을 붙잡아 두었다.</w:t>
+              <w:t>확실한 방법은 한 세션 안에서 `INSERT` → 대기 → 확인을 모두 처리하는 것이다. 실측에서는 `DBMS_SESSION.SLEEP(40)`을 썼다.</w:t>
             </w:r>
           </w:p>
           <w:p>
@@ -1710,7 +1710,7 @@
           <w:rFonts w:ascii="맑은 고딕" w:hAnsi="맑은 고딕" w:eastAsia="맑은 고딕"/>
           <w:sz w:val="21"/>
         </w:rPr>
-        <w:t>"읽기 전용이니 조회만 된다"고 정리하면 실제와 어긋난다. 몇 가지를 실측했다.</w:t>
+        <w:t>"읽기 전용이니 조회만 된다"고 정리하면 실제와 어긋난다.</w:t>
       </w:r>
     </w:p>
     <w:p>
@@ -1851,72 +1851,7 @@
                 <w:color w:val="F2F2F2"/>
                 <w:sz w:val="19"/>
               </w:rPr>
-              <w:t xml:space="preserve"> </w:t>
-            </w:r>
-          </w:p>
-          <w:p>
-            <w:pPr>
-              <w:spacing w:after="0" w:before="0"/>
-            </w:pPr>
-            <w:r>
-              <w:rPr>
-                <w:rFonts w:ascii="Consolas" w:hAnsi="Consolas" w:eastAsia="Consolas"/>
-                <w:color w:val="F2F2F2"/>
-                <w:sz w:val="19"/>
-              </w:rPr>
-              <w:t>TABLESPACE_NAME                   USED_MB</w:t>
-            </w:r>
-          </w:p>
-          <w:p>
-            <w:pPr>
-              <w:spacing w:after="0" w:before="0"/>
-            </w:pPr>
-            <w:r>
-              <w:rPr>
-                <w:rFonts w:ascii="Consolas" w:hAnsi="Consolas" w:eastAsia="Consolas"/>
-                <w:color w:val="F2F2F2"/>
-                <w:sz w:val="19"/>
-              </w:rPr>
-              <w:t>------------------------------ ----------</w:t>
-            </w:r>
-          </w:p>
-          <w:p>
-            <w:pPr>
-              <w:spacing w:after="0" w:before="0"/>
-            </w:pPr>
-            <w:r>
-              <w:rPr>
-                <w:rFonts w:ascii="Consolas" w:hAnsi="Consolas" w:eastAsia="Consolas"/>
-                <w:color w:val="F2F2F2"/>
-                <w:sz w:val="19"/>
-              </w:rPr>
-              <w:t>TEMP                                    3</w:t>
-            </w:r>
-          </w:p>
-          <w:p>
-            <w:pPr>
-              <w:spacing w:after="0" w:before="0"/>
-            </w:pPr>
-            <w:r>
-              <w:rPr>
-                <w:rFonts w:ascii="Consolas" w:hAnsi="Consolas" w:eastAsia="Consolas"/>
-                <w:color w:val="F2F2F2"/>
-                <w:sz w:val="19"/>
-              </w:rPr>
-              <w:t>TEMP                                    3</w:t>
-            </w:r>
-          </w:p>
-          <w:p>
-            <w:pPr>
-              <w:spacing w:after="0" w:before="0"/>
-            </w:pPr>
-            <w:r>
-              <w:rPr>
-                <w:rFonts w:ascii="Consolas" w:hAnsi="Consolas" w:eastAsia="Consolas"/>
-                <w:color w:val="F2F2F2"/>
-                <w:sz w:val="19"/>
-              </w:rPr>
-              <w:t>TEMP                                    3</w:t>
+              <w:t xml:space="preserve">   --&gt; TEMP 3 / TEMP 3 / TEMP 3</w:t>
             </w:r>
           </w:p>
         </w:tc>
@@ -1929,7 +1864,7 @@
           <w:rFonts w:ascii="맑은 고딕" w:hAnsi="맑은 고딕" w:eastAsia="맑은 고딕"/>
           <w:sz w:val="21"/>
         </w:rPr>
-        <w:t>7만 행을 정렬했고 임시 테이블스페이스가 실제로 쓰였다. Standby에서 무거운 조회를 돌릴 수 있다는 뜻이며, **보고서·집계 조회를 Standby로 옮기는** 전형적인 활용의 근거다.</w:t>
+        <w:t>7만 행을 정렬했고 임시 테이블스페이스가 실제로 쓰였다. **보고서·집계 조회를 Standby로 옮기는** 전형적인 활용의 근거다.</w:t>
       </w:r>
     </w:p>
     <w:p>
@@ -2018,59 +1953,7 @@
                 <w:color w:val="F2F2F2"/>
                 <w:sz w:val="19"/>
               </w:rPr>
-              <w:t>SYS@boston&gt; select count(*) plan_rows from plan_table;</w:t>
-            </w:r>
-          </w:p>
-          <w:p>
-            <w:pPr>
-              <w:spacing w:after="0" w:before="0"/>
-            </w:pPr>
-            <w:r>
-              <w:rPr>
-                <w:rFonts w:ascii="Consolas" w:hAnsi="Consolas" w:eastAsia="Consolas"/>
-                <w:color w:val="F2F2F2"/>
-                <w:sz w:val="19"/>
-              </w:rPr>
-              <w:t xml:space="preserve"> </w:t>
-            </w:r>
-          </w:p>
-          <w:p>
-            <w:pPr>
-              <w:spacing w:after="0" w:before="0"/>
-            </w:pPr>
-            <w:r>
-              <w:rPr>
-                <w:rFonts w:ascii="Consolas" w:hAnsi="Consolas" w:eastAsia="Consolas"/>
-                <w:color w:val="F2F2F2"/>
-                <w:sz w:val="19"/>
-              </w:rPr>
-              <w:t xml:space="preserve"> PLAN_ROWS</w:t>
-            </w:r>
-          </w:p>
-          <w:p>
-            <w:pPr>
-              <w:spacing w:after="0" w:before="0"/>
-            </w:pPr>
-            <w:r>
-              <w:rPr>
-                <w:rFonts w:ascii="Consolas" w:hAnsi="Consolas" w:eastAsia="Consolas"/>
-                <w:color w:val="F2F2F2"/>
-                <w:sz w:val="19"/>
-              </w:rPr>
-              <w:t>----------</w:t>
-            </w:r>
-          </w:p>
-          <w:p>
-            <w:pPr>
-              <w:spacing w:after="0" w:before="0"/>
-            </w:pPr>
-            <w:r>
-              <w:rPr>
-                <w:rFonts w:ascii="Consolas" w:hAnsi="Consolas" w:eastAsia="Consolas"/>
-                <w:color w:val="F2F2F2"/>
-                <w:sz w:val="19"/>
-              </w:rPr>
-              <w:t xml:space="preserve">        33</w:t>
+              <w:t>SYS@boston&gt; select count(*) plan_rows from plan_table;   --&gt; 33</w:t>
             </w:r>
           </w:p>
         </w:tc>
@@ -2172,137 +2055,20 @@
                 <w:color w:val="F2F2F2"/>
                 <w:sz w:val="19"/>
               </w:rPr>
-              <w:t>SYS@boston&gt; select count(*) from system.gtt;</w:t>
-            </w:r>
-          </w:p>
-          <w:p>
-            <w:pPr>
-              <w:spacing w:after="0" w:before="0"/>
-            </w:pPr>
-            <w:r>
-              <w:rPr>
-                <w:rFonts w:ascii="Consolas" w:hAnsi="Consolas" w:eastAsia="Consolas"/>
-                <w:color w:val="F2F2F2"/>
-                <w:sz w:val="19"/>
-              </w:rPr>
-              <w:t xml:space="preserve"> </w:t>
-            </w:r>
-          </w:p>
-          <w:p>
-            <w:pPr>
-              <w:spacing w:after="0" w:before="0"/>
-            </w:pPr>
-            <w:r>
-              <w:rPr>
-                <w:rFonts w:ascii="Consolas" w:hAnsi="Consolas" w:eastAsia="Consolas"/>
-                <w:color w:val="F2F2F2"/>
-                <w:sz w:val="19"/>
-              </w:rPr>
-              <w:t xml:space="preserve">  COUNT(*)</w:t>
-            </w:r>
-          </w:p>
-          <w:p>
-            <w:pPr>
-              <w:spacing w:after="0" w:before="0"/>
-            </w:pPr>
-            <w:r>
-              <w:rPr>
-                <w:rFonts w:ascii="Consolas" w:hAnsi="Consolas" w:eastAsia="Consolas"/>
-                <w:color w:val="F2F2F2"/>
-                <w:sz w:val="19"/>
-              </w:rPr>
-              <w:t>----------</w:t>
-            </w:r>
-          </w:p>
-          <w:p>
-            <w:pPr>
-              <w:spacing w:after="0" w:before="0"/>
-            </w:pPr>
-            <w:r>
-              <w:rPr>
-                <w:rFonts w:ascii="Consolas" w:hAnsi="Consolas" w:eastAsia="Consolas"/>
-                <w:color w:val="F2F2F2"/>
-                <w:sz w:val="19"/>
-              </w:rPr>
-              <w:t xml:space="preserve">         1</w:t>
-            </w:r>
-          </w:p>
-          <w:p>
-            <w:pPr>
-              <w:spacing w:after="0" w:before="0"/>
-            </w:pPr>
-            <w:r>
-              <w:rPr>
-                <w:rFonts w:ascii="Consolas" w:hAnsi="Consolas" w:eastAsia="Consolas"/>
-                <w:color w:val="F2F2F2"/>
-                <w:sz w:val="19"/>
-              </w:rPr>
-              <w:t xml:space="preserve"> </w:t>
-            </w:r>
-          </w:p>
-          <w:p>
-            <w:pPr>
-              <w:spacing w:after="0" w:before="0"/>
-            </w:pPr>
-            <w:r>
-              <w:rPr>
-                <w:rFonts w:ascii="Consolas" w:hAnsi="Consolas" w:eastAsia="Consolas"/>
-                <w:color w:val="F2F2F2"/>
-                <w:sz w:val="19"/>
-              </w:rPr>
-              <w:t>SYS@boston&gt; show parameter temp_undo_enabled</w:t>
-            </w:r>
-          </w:p>
-          <w:p>
-            <w:pPr>
-              <w:spacing w:after="0" w:before="0"/>
-            </w:pPr>
-            <w:r>
-              <w:rPr>
-                <w:rFonts w:ascii="Consolas" w:hAnsi="Consolas" w:eastAsia="Consolas"/>
-                <w:color w:val="F2F2F2"/>
-                <w:sz w:val="19"/>
-              </w:rPr>
-              <w:t xml:space="preserve"> </w:t>
-            </w:r>
-          </w:p>
-          <w:p>
-            <w:pPr>
-              <w:spacing w:after="0" w:before="0"/>
-            </w:pPr>
-            <w:r>
-              <w:rPr>
-                <w:rFonts w:ascii="Consolas" w:hAnsi="Consolas" w:eastAsia="Consolas"/>
-                <w:color w:val="F2F2F2"/>
-                <w:sz w:val="19"/>
-              </w:rPr>
-              <w:t>NAME                  TYPE      VALUE</w:t>
-            </w:r>
-          </w:p>
-          <w:p>
-            <w:pPr>
-              <w:spacing w:after="0" w:before="0"/>
-            </w:pPr>
-            <w:r>
-              <w:rPr>
-                <w:rFonts w:ascii="Consolas" w:hAnsi="Consolas" w:eastAsia="Consolas"/>
-                <w:color w:val="F2F2F2"/>
-                <w:sz w:val="19"/>
-              </w:rPr>
-              <w:t>--------------------- --------- -----</w:t>
-            </w:r>
-          </w:p>
-          <w:p>
-            <w:pPr>
-              <w:spacing w:after="0" w:before="0"/>
-            </w:pPr>
-            <w:r>
-              <w:rPr>
-                <w:rFonts w:ascii="Consolas" w:hAnsi="Consolas" w:eastAsia="Consolas"/>
-                <w:color w:val="F2F2F2"/>
-                <w:sz w:val="19"/>
-              </w:rPr>
-              <w:t>temp_undo_enabled     boolean   FALSE</w:t>
+              <w:t>SYS@boston&gt; select count(*) from system.gtt;              --&gt; 1</w:t>
+            </w:r>
+          </w:p>
+          <w:p>
+            <w:pPr>
+              <w:spacing w:after="0" w:before="0"/>
+            </w:pPr>
+            <w:r>
+              <w:rPr>
+                <w:rFonts w:ascii="Consolas" w:hAnsi="Consolas" w:eastAsia="Consolas"/>
+                <w:color w:val="F2F2F2"/>
+                <w:sz w:val="19"/>
+              </w:rPr>
+              <w:t>SYS@boston&gt; show parameter temp_undo_enabled              --&gt; FALSE</w:t>
             </w:r>
           </w:p>
         </w:tc>
@@ -2315,7 +2081,7 @@
           <w:rFonts w:ascii="맑은 고딕" w:hAnsi="맑은 고딕" w:eastAsia="맑은 고딕"/>
           <w:sz w:val="21"/>
         </w:rPr>
-        <w:t>GTT의 데이터는 임시 테이블스페이스에 있고 영구 데이터 파일을 건드리지 않는다. 그래서 읽기 전용 데이터베이스에서도 허용된다. 실측에서 `TEMP_UNDO_ENABLED`가 `FALSE`인데도 동작했다.</w:t>
+        <w:t>GTT의 데이터는 임시 테이블스페이스에 있어 영구 데이터 파일을 건드리지 않으므로 허용된다. `TEMP_UNDO_ENABLED`가 `FALSE`인데도 동작했다.</w:t>
       </w:r>
     </w:p>
     <w:p>
@@ -3387,7 +3153,7 @@
           <w:rFonts w:ascii="맑은 고딕" w:hAnsi="맑은 고딕" w:eastAsia="맑은 고딕"/>
           <w:sz w:val="21"/>
         </w:rPr>
-        <w:t>조회는 되는데 관리 작업은 어떤가. 세 가지를 시험했다.</w:t>
+        <w:t>관리 작업은 어떤가. 세 가지를 시험했다.</w:t>
       </w:r>
     </w:p>
     <w:p>
@@ -3589,16 +3355,7 @@
           <w:rFonts w:ascii="맑은 고딕" w:hAnsi="맑은 고딕" w:eastAsia="맑은 고딕"/>
           <w:sz w:val="21"/>
         </w:rPr>
-        <w:t>이런 스택을 읽을 때는 `ORA-06512`(PL/SQL 호출 스택)를 건너뛰고 **그것이 아닌 오류 번호**를 찾는다. 여기서는 `ORA-00604`와 `ORA-16000` 둘인데, 앞의 것은 "재귀 SQL에서 났다"는 포장이고 뒤의 것이 내용이다.</w:t>
-      </w:r>
-    </w:p>
-    <w:p>
-      <w:r>
-        <w:rPr>
-          <w:rFonts w:ascii="맑은 고딕" w:hAnsi="맑은 고딕" w:eastAsia="맑은 고딕"/>
-          <w:sz w:val="21"/>
-        </w:rPr>
-        <w:t>`DBMS_STATS.SET_GLOBAL_PREFS`도 같은 결과였다. 통계 관련 작업은 딕셔너리를 바꾸므로 읽기 전용에서 할 수 없다.</w:t>
+        <w:t>이런 스택은 `ORA-06512`(PL/SQL 호출 스택)를 건너뛰고 **그것이 아닌 번호**를 찾는다. `ORA-00604`는 "재귀 SQL에서 났다"는 포장이고 `ORA-16000`이 내용이다. `DBMS_STATS.SET_GLOBAL_PREFS`도 같은 결과였다.</w:t>
       </w:r>
     </w:p>
     <w:p>
@@ -3739,7 +3496,7 @@
           <w:rFonts w:ascii="맑은 고딕" w:hAnsi="맑은 고딕" w:eastAsia="맑은 고딕"/>
           <w:sz w:val="21"/>
         </w:rPr>
-        <w:t>**ORA-13516**이라는 전용 오류 번호가 있다. 메시지도 `database not open readwrite`로 직접적이다. AWR은 자주 시도되는 작업이라 오라클이 별도 오류를 마련해 둔 것으로 보인다.</w:t>
+        <w:t>**ORA-13516**이라는 전용 오류 번호가 있고 메시지도 직접적이다. AWR 은 자주 시도되는 작업이라 별도 오류를 둔 것으로 보인다.</w:t>
       </w:r>
     </w:p>
     <w:p>
@@ -3748,7 +3505,7 @@
           <w:rFonts w:ascii="맑은 고딕" w:hAnsi="맑은 고딕" w:eastAsia="맑은 고딕"/>
           <w:sz w:val="21"/>
         </w:rPr>
-        <w:t>스택도 짧다. `ORA-16000`까지 내려가기 전에 AWR 패키지가 먼저 상태를 확인하고 거부했기 때문이다. **오류 번호와 스택 길이가 그 기능이 상태를 얼마나 일찍 점검하는지를 보여 준다.**</w:t>
+        <w:t>스택도 짧다. `ORA-16000`까지 가기 전에 AWR 패키지가 먼저 상태를 확인하고 거부했기 때문이다.</w:t>
       </w:r>
     </w:p>
     <w:p>
@@ -3785,59 +3542,7 @@
                 <w:color w:val="F2F2F2"/>
                 <w:sz w:val="19"/>
               </w:rPr>
-              <w:t>SYS@boston&gt; select count(*) from v$sysstat where name like 'redo%';</w:t>
-            </w:r>
-          </w:p>
-          <w:p>
-            <w:pPr>
-              <w:spacing w:after="0" w:before="0"/>
-            </w:pPr>
-            <w:r>
-              <w:rPr>
-                <w:rFonts w:ascii="Consolas" w:hAnsi="Consolas" w:eastAsia="Consolas"/>
-                <w:color w:val="F2F2F2"/>
-                <w:sz w:val="19"/>
-              </w:rPr>
-              <w:t xml:space="preserve"> </w:t>
-            </w:r>
-          </w:p>
-          <w:p>
-            <w:pPr>
-              <w:spacing w:after="0" w:before="0"/>
-            </w:pPr>
-            <w:r>
-              <w:rPr>
-                <w:rFonts w:ascii="Consolas" w:hAnsi="Consolas" w:eastAsia="Consolas"/>
-                <w:color w:val="F2F2F2"/>
-                <w:sz w:val="19"/>
-              </w:rPr>
-              <w:t xml:space="preserve">  COUNT(*)</w:t>
-            </w:r>
-          </w:p>
-          <w:p>
-            <w:pPr>
-              <w:spacing w:after="0" w:before="0"/>
-            </w:pPr>
-            <w:r>
-              <w:rPr>
-                <w:rFonts w:ascii="Consolas" w:hAnsi="Consolas" w:eastAsia="Consolas"/>
-                <w:color w:val="F2F2F2"/>
-                <w:sz w:val="19"/>
-              </w:rPr>
-              <w:t>----------</w:t>
-            </w:r>
-          </w:p>
-          <w:p>
-            <w:pPr>
-              <w:spacing w:after="0" w:before="0"/>
-            </w:pPr>
-            <w:r>
-              <w:rPr>
-                <w:rFonts w:ascii="Consolas" w:hAnsi="Consolas" w:eastAsia="Consolas"/>
-                <w:color w:val="F2F2F2"/>
-                <w:sz w:val="19"/>
-              </w:rPr>
-              <w:t xml:space="preserve">       100</w:t>
+              <w:t>SYS@boston&gt; select count(*) from v$sysstat where name like 'redo%';   --&gt; 100</w:t>
             </w:r>
           </w:p>
         </w:tc>
@@ -3850,7 +3555,7 @@
           <w:rFonts w:ascii="맑은 고딕" w:hAnsi="맑은 고딕" w:eastAsia="맑은 고딕"/>
           <w:sz w:val="21"/>
         </w:rPr>
-        <w:t>`V$` 뷰는 메모리 구조를 읽는 것이므로 아무 문제가 없다. 그래서 Standby의 상태 진단은 전부 가능하다. 이 과정에서 지금까지 써 온 조회들이 모두 여기에 속한다.</w:t>
+        <w:t>`V$` 뷰는 메모리 구조를 읽는 것이므로 문제가 없고, 그래서 Standby 상태 진단은 전부 가능하다.</w:t>
       </w:r>
     </w:p>
     <w:p>
@@ -3859,7 +3564,7 @@
           <w:rFonts w:ascii="맑은 고딕" w:hAnsi="맑은 고딕" w:eastAsia="맑은 고딕"/>
           <w:sz w:val="21"/>
         </w:rPr>
-        <w:t>정리하면 **"보는 것은 되고 남기는 것은 안 된다."** 진단은 할 수 있지만 그 결과를 데이터베이스에 저장할 수는 없다. Standby의 성능 정보를 축적하려면 조회 결과를 다른 곳으로 내보내야 한다.</w:t>
+        <w:t>정리하면 **"보는 것은 되고 남기는 것은 안 된다."** 성능 정보를 축적하려면 조회 결과를 밖으로 내보내야 한다.</w:t>
       </w:r>
     </w:p>
     <w:p>
@@ -7938,7 +7643,7 @@
     <w:p/>
     <w:p>
       <w:pPr>
-        <w:pStyle w:val="Heading2"/>
+        <w:pStyle w:val="Heading3"/>
       </w:pPr>
       <w:r>
         <w:t>9.7.1  ADG 상태를 한 번에 보는 조회</w:t>
@@ -8507,7 +8212,763 @@
         <w:pStyle w:val="Heading2"/>
       </w:pPr>
       <w:r>
-        <w:t>9.8  요약</w:t>
+        <w:t>9.8  옵션이 없다면 — MOUNTED 로 두고 확인한다</w:t>
+      </w:r>
+    </w:p>
+    <w:p>
+      <w:r>
+        <w:rPr>
+          <w:rFonts w:ascii="맑은 고딕" w:hAnsi="맑은 고딕" w:eastAsia="맑은 고딕"/>
+          <w:sz w:val="21"/>
+        </w:rPr>
+        <w:t>9.2.2절에서 **MOUNTED로만 두면 옵션이 필요 없고 여는 순간부터 옵션의 영역**이라고 했다. 그러면 열지 않은 채로 동기화를 어떻게 확인하는가.</w:t>
+      </w:r>
+    </w:p>
+    <w:p>
+      <w:pPr>
+        <w:pStyle w:val="Heading3"/>
+      </w:pPr>
+      <w:r>
+        <w:t>9.8.1  닫아도 적용은 돈다</w:t>
+      </w:r>
+    </w:p>
+    <w:p>
+      <w:r>
+        <w:rPr>
+          <w:rFonts w:ascii="맑은 고딕" w:hAnsi="맑은 고딕" w:eastAsia="맑은 고딕"/>
+          <w:sz w:val="21"/>
+        </w:rPr>
+        <w:t>boston을 `SHUTDOWN IMMEDIATE` → `STARTUP MOUNT`로 내리고 MRP만 다시 띄운다.</w:t>
+      </w:r>
+    </w:p>
+    <w:tbl>
+      <w:tblPr>
+        <w:tblStyle w:val="TableGrid"/>
+        <w:tblW w:type="auto" w:w="0"/>
+        <w:tblLook w:firstColumn="1" w:firstRow="1" w:lastColumn="0" w:lastRow="0" w:noHBand="0" w:noVBand="1" w:val="04A0"/>
+      </w:tblPr>
+      <w:tblGrid>
+        <w:gridCol w:w="8640"/>
+      </w:tblGrid>
+      <w:tr>
+        <w:tc>
+          <w:tcPr>
+            <w:tcW w:type="dxa" w:w="8640"/>
+            <w:shd w:val="clear" w:color="auto" w:fill="1E1E1E"/>
+          </w:tcPr>
+          <w:p>
+            <w:pPr>
+              <w:spacing w:after="0" w:before="0"/>
+            </w:pPr>
+            <w:r>
+              <w:rPr>
+                <w:rFonts w:ascii="Consolas" w:hAnsi="Consolas" w:eastAsia="Consolas"/>
+                <w:color w:val="F2F2F2"/>
+                <w:sz w:val="19"/>
+              </w:rPr>
+              <w:t>SYS@boston&gt; select database_role, open_mode from v$database;</w:t>
+            </w:r>
+          </w:p>
+          <w:p>
+            <w:pPr>
+              <w:spacing w:after="0" w:before="0"/>
+            </w:pPr>
+            <w:r>
+              <w:rPr>
+                <w:rFonts w:ascii="Consolas" w:hAnsi="Consolas" w:eastAsia="Consolas"/>
+                <w:color w:val="F2F2F2"/>
+                <w:sz w:val="19"/>
+              </w:rPr>
+              <w:t xml:space="preserve"> </w:t>
+            </w:r>
+          </w:p>
+          <w:p>
+            <w:pPr>
+              <w:spacing w:after="0" w:before="0"/>
+            </w:pPr>
+            <w:r>
+              <w:rPr>
+                <w:rFonts w:ascii="Consolas" w:hAnsi="Consolas" w:eastAsia="Consolas"/>
+                <w:color w:val="F2F2F2"/>
+                <w:sz w:val="19"/>
+              </w:rPr>
+              <w:t>DATABASE_ROLE    OPEN_MODE</w:t>
+            </w:r>
+          </w:p>
+          <w:p>
+            <w:pPr>
+              <w:spacing w:after="0" w:before="0"/>
+            </w:pPr>
+            <w:r>
+              <w:rPr>
+                <w:rFonts w:ascii="Consolas" w:hAnsi="Consolas" w:eastAsia="Consolas"/>
+                <w:color w:val="F2F2F2"/>
+                <w:sz w:val="19"/>
+              </w:rPr>
+              <w:t>---------------- ----------</w:t>
+            </w:r>
+          </w:p>
+          <w:p>
+            <w:pPr>
+              <w:spacing w:after="0" w:before="0"/>
+            </w:pPr>
+            <w:r>
+              <w:rPr>
+                <w:rFonts w:ascii="Consolas" w:hAnsi="Consolas" w:eastAsia="Consolas"/>
+                <w:color w:val="F2F2F2"/>
+                <w:sz w:val="19"/>
+              </w:rPr>
+              <w:t>PHYSICAL STANDBY MOUNTED</w:t>
+            </w:r>
+          </w:p>
+          <w:p>
+            <w:pPr>
+              <w:spacing w:after="0" w:before="0"/>
+            </w:pPr>
+            <w:r>
+              <w:rPr>
+                <w:rFonts w:ascii="Consolas" w:hAnsi="Consolas" w:eastAsia="Consolas"/>
+                <w:color w:val="F2F2F2"/>
+                <w:sz w:val="19"/>
+              </w:rPr>
+              <w:t xml:space="preserve"> </w:t>
+            </w:r>
+          </w:p>
+          <w:p>
+            <w:pPr>
+              <w:spacing w:after="0" w:before="0"/>
+            </w:pPr>
+            <w:r>
+              <w:rPr>
+                <w:rFonts w:ascii="Consolas" w:hAnsi="Consolas" w:eastAsia="Consolas"/>
+                <w:color w:val="F2F2F2"/>
+                <w:sz w:val="19"/>
+              </w:rPr>
+              <w:t>SYS@boston&gt; select process, status, sequence# from v$managed_standby</w:t>
+            </w:r>
+          </w:p>
+          <w:p>
+            <w:pPr>
+              <w:spacing w:after="0" w:before="0"/>
+            </w:pPr>
+            <w:r>
+              <w:rPr>
+                <w:rFonts w:ascii="Consolas" w:hAnsi="Consolas" w:eastAsia="Consolas"/>
+                <w:color w:val="F2F2F2"/>
+                <w:sz w:val="19"/>
+              </w:rPr>
+              <w:t xml:space="preserve">  2            where process='MRP0';</w:t>
+            </w:r>
+          </w:p>
+          <w:p>
+            <w:pPr>
+              <w:spacing w:after="0" w:before="0"/>
+            </w:pPr>
+            <w:r>
+              <w:rPr>
+                <w:rFonts w:ascii="Consolas" w:hAnsi="Consolas" w:eastAsia="Consolas"/>
+                <w:color w:val="F2F2F2"/>
+                <w:sz w:val="19"/>
+              </w:rPr>
+              <w:t xml:space="preserve"> </w:t>
+            </w:r>
+          </w:p>
+          <w:p>
+            <w:pPr>
+              <w:spacing w:after="0" w:before="0"/>
+            </w:pPr>
+            <w:r>
+              <w:rPr>
+                <w:rFonts w:ascii="Consolas" w:hAnsi="Consolas" w:eastAsia="Consolas"/>
+                <w:color w:val="F2F2F2"/>
+                <w:sz w:val="19"/>
+              </w:rPr>
+              <w:t>PROCESS   STATUS         SEQUENCE#</w:t>
+            </w:r>
+          </w:p>
+          <w:p>
+            <w:pPr>
+              <w:spacing w:after="0" w:before="0"/>
+            </w:pPr>
+            <w:r>
+              <w:rPr>
+                <w:rFonts w:ascii="Consolas" w:hAnsi="Consolas" w:eastAsia="Consolas"/>
+                <w:color w:val="F2F2F2"/>
+                <w:sz w:val="19"/>
+              </w:rPr>
+              <w:t>--------- ------------ ----------</w:t>
+            </w:r>
+          </w:p>
+          <w:p>
+            <w:pPr>
+              <w:spacing w:after="0" w:before="0"/>
+            </w:pPr>
+            <w:r>
+              <w:rPr>
+                <w:rFonts w:ascii="Consolas" w:hAnsi="Consolas" w:eastAsia="Consolas"/>
+                <w:color w:val="F2F2F2"/>
+                <w:sz w:val="19"/>
+              </w:rPr>
+              <w:t>MRP0      APPLYING_LOG         11</w:t>
+            </w:r>
+          </w:p>
+        </w:tc>
+      </w:tr>
+    </w:tbl>
+    <w:p/>
+    <w:p>
+      <w:r>
+        <w:rPr>
+          <w:rFonts w:ascii="맑은 고딕" w:hAnsi="맑은 고딕" w:eastAsia="맑은 고딕"/>
+          <w:sz w:val="21"/>
+        </w:rPr>
+        <w:t>**적용은 그대로 돈다.** `USING CURRENT LOGFILE`도 쓸 수 있어 실시간 적용이며, 재해 복구 능력은 줄지 않는다. 줄어드는 것은 조회뿐이다.</w:t>
+      </w:r>
+    </w:p>
+    <w:tbl>
+      <w:tblPr>
+        <w:tblStyle w:val="TableGrid"/>
+        <w:tblW w:type="auto" w:w="0"/>
+        <w:tblLook w:firstColumn="1" w:firstRow="1" w:lastColumn="0" w:lastRow="0" w:noHBand="0" w:noVBand="1" w:val="04A0"/>
+      </w:tblPr>
+      <w:tblGrid>
+        <w:gridCol w:w="8640"/>
+      </w:tblGrid>
+      <w:tr>
+        <w:tc>
+          <w:tcPr>
+            <w:tcW w:type="dxa" w:w="8640"/>
+            <w:shd w:val="clear" w:color="auto" w:fill="1E1E1E"/>
+          </w:tcPr>
+          <w:p>
+            <w:pPr>
+              <w:spacing w:after="0" w:before="0"/>
+            </w:pPr>
+            <w:r>
+              <w:rPr>
+                <w:rFonts w:ascii="Consolas" w:hAnsi="Consolas" w:eastAsia="Consolas"/>
+                <w:color w:val="F2F2F2"/>
+                <w:sz w:val="19"/>
+              </w:rPr>
+              <w:t>SYS@boston&gt; select count(*) from system.bk_t;</w:t>
+            </w:r>
+          </w:p>
+          <w:p>
+            <w:pPr>
+              <w:spacing w:after="0" w:before="0"/>
+            </w:pPr>
+            <w:r>
+              <w:rPr>
+                <w:rFonts w:ascii="Consolas" w:hAnsi="Consolas" w:eastAsia="Consolas"/>
+                <w:color w:val="F2F2F2"/>
+                <w:sz w:val="19"/>
+              </w:rPr>
+              <w:t xml:space="preserve"> </w:t>
+            </w:r>
+          </w:p>
+          <w:p>
+            <w:pPr>
+              <w:spacing w:after="0" w:before="0"/>
+            </w:pPr>
+            <w:r>
+              <w:rPr>
+                <w:rFonts w:ascii="Consolas" w:hAnsi="Consolas" w:eastAsia="Consolas"/>
+                <w:color w:val="F2F2F2"/>
+                <w:sz w:val="19"/>
+              </w:rPr>
+              <w:t>select count(*) from system.bk_t</w:t>
+            </w:r>
+          </w:p>
+          <w:p>
+            <w:pPr>
+              <w:spacing w:after="0" w:before="0"/>
+            </w:pPr>
+            <w:r>
+              <w:rPr>
+                <w:rFonts w:ascii="Consolas" w:hAnsi="Consolas" w:eastAsia="Consolas"/>
+                <w:color w:val="F2F2F2"/>
+                <w:sz w:val="19"/>
+              </w:rPr>
+              <w:t xml:space="preserve">                            *</w:t>
+            </w:r>
+          </w:p>
+          <w:p>
+            <w:pPr>
+              <w:spacing w:after="0" w:before="0"/>
+            </w:pPr>
+            <w:r>
+              <w:rPr>
+                <w:rFonts w:ascii="Consolas" w:hAnsi="Consolas" w:eastAsia="Consolas"/>
+                <w:color w:val="F2F2F2"/>
+                <w:sz w:val="19"/>
+              </w:rPr>
+              <w:t>ERROR at line 1:</w:t>
+            </w:r>
+          </w:p>
+          <w:p>
+            <w:pPr>
+              <w:spacing w:after="0" w:before="0"/>
+            </w:pPr>
+            <w:r>
+              <w:rPr>
+                <w:rFonts w:ascii="Consolas" w:hAnsi="Consolas" w:eastAsia="Consolas"/>
+                <w:color w:val="F2F2F2"/>
+                <w:sz w:val="19"/>
+              </w:rPr>
+              <w:t>ORA-01219: database or pluggable database not open:</w:t>
+            </w:r>
+          </w:p>
+          <w:p>
+            <w:pPr>
+              <w:spacing w:after="0" w:before="0"/>
+            </w:pPr>
+            <w:r>
+              <w:rPr>
+                <w:rFonts w:ascii="Consolas" w:hAnsi="Consolas" w:eastAsia="Consolas"/>
+                <w:color w:val="F2F2F2"/>
+                <w:sz w:val="19"/>
+              </w:rPr>
+              <w:t xml:space="preserve">           queries allowed on fixed tables or views only</w:t>
+            </w:r>
+          </w:p>
+        </w:tc>
+      </w:tr>
+    </w:tbl>
+    <w:p/>
+    <w:p>
+      <w:r>
+        <w:rPr>
+          <w:rFonts w:ascii="맑은 고딕" w:hAnsi="맑은 고딕" w:eastAsia="맑은 고딕"/>
+          <w:sz w:val="21"/>
+        </w:rPr>
+        <w:t>**ORA-01219**다. 9.4.1절의 `ORA-16000`(읽기 전용이라 쓸 수 없다)과는 다른 번호이며, **열려 있지 않아 사용자 표를 못 읽는다**는 뜻이다. 오류 번호가 상태를 알려 준다.</w:t>
+      </w:r>
+    </w:p>
+    <w:p>
+      <w:r>
+        <w:rPr>
+          <w:rFonts w:ascii="맑은 고딕" w:hAnsi="맑은 고딕" w:eastAsia="맑은 고딕"/>
+          <w:sz w:val="21"/>
+        </w:rPr>
+        <w:t>그런데 메시지 뒷부분이 중요하다. **"queries allowed on fixed tables or views only"** — 고정 뷰는 조회된다.</w:t>
+      </w:r>
+    </w:p>
+    <w:tbl>
+      <w:tblPr>
+        <w:tblStyle w:val="TableGrid"/>
+        <w:tblW w:type="auto" w:w="0"/>
+        <w:tblLook w:firstColumn="1" w:firstRow="1" w:lastColumn="0" w:lastRow="0" w:noHBand="0" w:noVBand="1" w:val="04A0"/>
+      </w:tblPr>
+      <w:tblGrid>
+        <w:gridCol w:w="8640"/>
+      </w:tblGrid>
+      <w:tr>
+        <w:tc>
+          <w:tcPr>
+            <w:tcW w:type="dxa" w:w="8640"/>
+            <w:shd w:val="clear" w:color="auto" w:fill="1E1E1E"/>
+          </w:tcPr>
+          <w:p>
+            <w:pPr>
+              <w:spacing w:after="0" w:before="0"/>
+            </w:pPr>
+            <w:r>
+              <w:rPr>
+                <w:rFonts w:ascii="Consolas" w:hAnsi="Consolas" w:eastAsia="Consolas"/>
+                <w:color w:val="F2F2F2"/>
+                <w:sz w:val="19"/>
+              </w:rPr>
+              <w:t>SYS@boston&gt; select name, value from v$dataguard_stats where name like '%lag';</w:t>
+            </w:r>
+          </w:p>
+          <w:p>
+            <w:pPr>
+              <w:spacing w:after="0" w:before="0"/>
+            </w:pPr>
+            <w:r>
+              <w:rPr>
+                <w:rFonts w:ascii="Consolas" w:hAnsi="Consolas" w:eastAsia="Consolas"/>
+                <w:color w:val="F2F2F2"/>
+                <w:sz w:val="19"/>
+              </w:rPr>
+              <w:t xml:space="preserve"> </w:t>
+            </w:r>
+          </w:p>
+          <w:p>
+            <w:pPr>
+              <w:spacing w:after="0" w:before="0"/>
+            </w:pPr>
+            <w:r>
+              <w:rPr>
+                <w:rFonts w:ascii="Consolas" w:hAnsi="Consolas" w:eastAsia="Consolas"/>
+                <w:color w:val="F2F2F2"/>
+                <w:sz w:val="19"/>
+              </w:rPr>
+              <w:t>NAME             VALUE</w:t>
+            </w:r>
+          </w:p>
+          <w:p>
+            <w:pPr>
+              <w:spacing w:after="0" w:before="0"/>
+            </w:pPr>
+            <w:r>
+              <w:rPr>
+                <w:rFonts w:ascii="Consolas" w:hAnsi="Consolas" w:eastAsia="Consolas"/>
+                <w:color w:val="F2F2F2"/>
+                <w:sz w:val="19"/>
+              </w:rPr>
+              <w:t>---------------- --------------------</w:t>
+            </w:r>
+          </w:p>
+          <w:p>
+            <w:pPr>
+              <w:spacing w:after="0" w:before="0"/>
+            </w:pPr>
+            <w:r>
+              <w:rPr>
+                <w:rFonts w:ascii="Consolas" w:hAnsi="Consolas" w:eastAsia="Consolas"/>
+                <w:color w:val="F2F2F2"/>
+                <w:sz w:val="19"/>
+              </w:rPr>
+              <w:t>transport lag    +00 00:00:00</w:t>
+            </w:r>
+          </w:p>
+          <w:p>
+            <w:pPr>
+              <w:spacing w:after="0" w:before="0"/>
+            </w:pPr>
+            <w:r>
+              <w:rPr>
+                <w:rFonts w:ascii="Consolas" w:hAnsi="Consolas" w:eastAsia="Consolas"/>
+                <w:color w:val="F2F2F2"/>
+                <w:sz w:val="19"/>
+              </w:rPr>
+              <w:t>apply lag        +00 00:00:00</w:t>
+            </w:r>
+          </w:p>
+        </w:tc>
+      </w:tr>
+    </w:tbl>
+    <w:p/>
+    <w:p>
+      <w:r>
+        <w:rPr>
+          <w:rFonts w:ascii="맑은 고딕" w:hAnsi="맑은 고딕" w:eastAsia="맑은 고딕"/>
+          <w:sz w:val="21"/>
+        </w:rPr>
+        <w:t>**닫혀 있어도 두 지연이 나온다.** 이것이 옵션 없이 동기화를 재는 첫 번째 방법이다. Standby에 SYSDBA로 붙기만 하면 된다.</w:t>
+      </w:r>
+    </w:p>
+    <w:p>
+      <w:r>
+        <w:rPr>
+          <w:rFonts w:ascii="맑은 고딕" w:hAnsi="맑은 고딕" w:eastAsia="맑은 고딕"/>
+          <w:sz w:val="21"/>
+        </w:rPr>
+        <w:t>PDB 서비스는 사라져 그 서비스로 접속하면 **`ORA-12514`**다. 15장에서 리스너를 내렸을 때의 `ORA-12541`과 구별한다. **리스너는 살아 있고 등록된 서비스만 사라진 것**이다.</w:t>
+      </w:r>
+    </w:p>
+    <w:p>
+      <w:pPr>
+        <w:pStyle w:val="Heading3"/>
+      </w:pPr>
+      <w:r>
+        <w:t>9.8.2  Primary 에서 읽는 두 열</w:t>
+      </w:r>
+    </w:p>
+    <w:p>
+      <w:r>
+        <w:rPr>
+          <w:rFonts w:ascii="맑은 고딕" w:hAnsi="맑은 고딕" w:eastAsia="맑은 고딕"/>
+          <w:sz w:val="21"/>
+        </w:rPr>
+        <w:t>Standby에 붙지 못하는 상황이라면 Primary만으로 판단해야 한다.</w:t>
+      </w:r>
+    </w:p>
+    <w:tbl>
+      <w:tblPr>
+        <w:tblStyle w:val="TableGrid"/>
+        <w:tblW w:type="auto" w:w="0"/>
+        <w:tblLook w:firstColumn="1" w:firstRow="1" w:lastColumn="0" w:lastRow="0" w:noHBand="0" w:noVBand="1" w:val="04A0"/>
+      </w:tblPr>
+      <w:tblGrid>
+        <w:gridCol w:w="8640"/>
+      </w:tblGrid>
+      <w:tr>
+        <w:tc>
+          <w:tcPr>
+            <w:tcW w:type="dxa" w:w="8640"/>
+            <w:shd w:val="clear" w:color="auto" w:fill="1E1E1E"/>
+          </w:tcPr>
+          <w:p>
+            <w:pPr>
+              <w:spacing w:after="0" w:before="0"/>
+            </w:pPr>
+            <w:r>
+              <w:rPr>
+                <w:rFonts w:ascii="Consolas" w:hAnsi="Consolas" w:eastAsia="Consolas"/>
+                <w:color w:val="F2F2F2"/>
+                <w:sz w:val="19"/>
+              </w:rPr>
+              <w:t>SYS@chicago&gt; select dest_id, destination, database_mode, recovery_mode,</w:t>
+            </w:r>
+          </w:p>
+          <w:p>
+            <w:pPr>
+              <w:spacing w:after="0" w:before="0"/>
+            </w:pPr>
+            <w:r>
+              <w:rPr>
+                <w:rFonts w:ascii="Consolas" w:hAnsi="Consolas" w:eastAsia="Consolas"/>
+                <w:color w:val="F2F2F2"/>
+                <w:sz w:val="19"/>
+              </w:rPr>
+              <w:t xml:space="preserve">  2                 archived_seq#, applied_seq#</w:t>
+            </w:r>
+          </w:p>
+          <w:p>
+            <w:pPr>
+              <w:spacing w:after="0" w:before="0"/>
+            </w:pPr>
+            <w:r>
+              <w:rPr>
+                <w:rFonts w:ascii="Consolas" w:hAnsi="Consolas" w:eastAsia="Consolas"/>
+                <w:color w:val="F2F2F2"/>
+                <w:sz w:val="19"/>
+              </w:rPr>
+              <w:t xml:space="preserve">  3            from v$archive_dest_status where dest_id=2;</w:t>
+            </w:r>
+          </w:p>
+          <w:p>
+            <w:pPr>
+              <w:spacing w:after="0" w:before="0"/>
+            </w:pPr>
+            <w:r>
+              <w:rPr>
+                <w:rFonts w:ascii="Consolas" w:hAnsi="Consolas" w:eastAsia="Consolas"/>
+                <w:color w:val="F2F2F2"/>
+                <w:sz w:val="19"/>
+              </w:rPr>
+              <w:t xml:space="preserve"> </w:t>
+            </w:r>
+          </w:p>
+          <w:p>
+            <w:pPr>
+              <w:spacing w:after="0" w:before="0"/>
+            </w:pPr>
+            <w:r>
+              <w:rPr>
+                <w:rFonts w:ascii="Consolas" w:hAnsi="Consolas" w:eastAsia="Consolas"/>
+                <w:color w:val="F2F2F2"/>
+                <w:sz w:val="19"/>
+              </w:rPr>
+              <w:t>-- Standby 가 열려 있을 때</w:t>
+            </w:r>
+          </w:p>
+          <w:p>
+            <w:pPr>
+              <w:spacing w:after="0" w:before="0"/>
+            </w:pPr>
+            <w:r>
+              <w:rPr>
+                <w:rFonts w:ascii="Consolas" w:hAnsi="Consolas" w:eastAsia="Consolas"/>
+                <w:color w:val="F2F2F2"/>
+                <w:sz w:val="19"/>
+              </w:rPr>
+              <w:t xml:space="preserve">   2 boston  OPEN_READ-ONLY   MANAGED REAL TIME APPLY WITH QUERY    9   8</w:t>
+            </w:r>
+          </w:p>
+          <w:p>
+            <w:pPr>
+              <w:spacing w:after="0" w:before="0"/>
+            </w:pPr>
+            <w:r>
+              <w:rPr>
+                <w:rFonts w:ascii="Consolas" w:hAnsi="Consolas" w:eastAsia="Consolas"/>
+                <w:color w:val="F2F2F2"/>
+                <w:sz w:val="19"/>
+              </w:rPr>
+              <w:t xml:space="preserve"> </w:t>
+            </w:r>
+          </w:p>
+          <w:p>
+            <w:pPr>
+              <w:spacing w:after="0" w:before="0"/>
+            </w:pPr>
+            <w:r>
+              <w:rPr>
+                <w:rFonts w:ascii="Consolas" w:hAnsi="Consolas" w:eastAsia="Consolas"/>
+                <w:color w:val="F2F2F2"/>
+                <w:sz w:val="19"/>
+              </w:rPr>
+              <w:t>-- Standby 를 닫은 뒤</w:t>
+            </w:r>
+          </w:p>
+          <w:p>
+            <w:pPr>
+              <w:spacing w:after="0" w:before="0"/>
+            </w:pPr>
+            <w:r>
+              <w:rPr>
+                <w:rFonts w:ascii="Consolas" w:hAnsi="Consolas" w:eastAsia="Consolas"/>
+                <w:color w:val="F2F2F2"/>
+                <w:sz w:val="19"/>
+              </w:rPr>
+              <w:t xml:space="preserve">   2 boston  MOUNTED-STANDBY  MANAGED REAL TIME APPLY              11  10</w:t>
+            </w:r>
+          </w:p>
+        </w:tc>
+      </w:tr>
+    </w:tbl>
+    <w:p/>
+    <w:p>
+      <w:r>
+        <w:rPr>
+          <w:rFonts w:ascii="맑은 고딕" w:hAnsi="맑은 고딕" w:eastAsia="맑은 고딕"/>
+          <w:sz w:val="21"/>
+        </w:rPr>
+        <w:t>두 열이 함께 바뀐다. **`DATABASE_MODE`가 `OPEN_READ-ONLY` → `MOUNTED-STANDBY`**, `RECOVERY_MODE`에서 **`WITH QUERY`가 사라진다.**</w:t>
+      </w:r>
+    </w:p>
+    <w:p>
+      <w:r>
+        <w:rPr>
+          <w:rFonts w:ascii="맑은 고딕" w:hAnsi="맑은 고딕" w:eastAsia="맑은 고딕"/>
+          <w:sz w:val="21"/>
+        </w:rPr>
+        <w:t>9.2.1절에서 정리한 표식 둘에 하나가 더 붙는 셈이며, 이것은 **Primary에서 보이는** 표식이다. `WITH QUERY`가 있으면 그 Standby는 열려 있고 곧 옵션을 쓰고 있다는 뜻이다.</w:t>
+      </w:r>
+    </w:p>
+    <w:p>
+      <w:r>
+        <w:rPr>
+          <w:rFonts w:ascii="맑은 고딕" w:hAnsi="맑은 고딕" w:eastAsia="맑은 고딕"/>
+          <w:sz w:val="21"/>
+        </w:rPr>
+        <w:t>`APPLIED_SEQ#`는 닫은 뒤에도 계속 올라간다(8 → 10). `ARCHIVED_SEQ#`와의 차이가 밀린 양이다. **이 두 숫자의 비교가 옵션 없이 동기화를 재는 두 번째 방법이다.**</w:t>
+      </w:r>
+    </w:p>
+    <w:tbl>
+      <w:tblPr>
+        <w:tblStyle w:val="TableGrid"/>
+        <w:tblW w:type="auto" w:w="0"/>
+        <w:tblLook w:firstColumn="1" w:firstRow="1" w:lastColumn="0" w:lastRow="0" w:noHBand="0" w:noVBand="1" w:val="04A0"/>
+      </w:tblPr>
+      <w:tblGrid>
+        <w:gridCol w:w="8640"/>
+      </w:tblGrid>
+      <w:tr>
+        <w:tc>
+          <w:tcPr>
+            <w:tcW w:type="dxa" w:w="8640"/>
+            <w:shd w:val="clear" w:color="auto" w:fill="FFF6D5"/>
+          </w:tcPr>
+          <w:p>
+            <w:r>
+              <w:rPr>
+                <w:rFonts w:ascii="맑은 고딕" w:hAnsi="맑은 고딕" w:eastAsia="맑은 고딕"/>
+                <w:b/>
+                <w:sz w:val="21"/>
+              </w:rPr>
+              <w:t>Note · Primary 에서는 두 지연을 볼 수 없다</w:t>
+            </w:r>
+          </w:p>
+          <w:p>
+            <w:pPr>
+              <w:spacing w:after="20"/>
+            </w:pPr>
+            <w:r>
+              <w:rPr>
+                <w:rFonts w:ascii="맑은 고딕" w:hAnsi="맑은 고딕" w:eastAsia="맑은 고딕"/>
+                <w:sz w:val="20"/>
+              </w:rPr>
+              <w:t>`V$DATAGUARD_STATS`를 Primary에서 조회하면 **0행**이다. 열려 있을 때도 닫은 뒤에도 마찬가지이므로 "Primary에서 이 뷰로 확인한다"는 방법은 **성립하지 않는다.** 이 뷰는 받는 쪽의 것이며, 다만 **MOUNTED Standby에서는 조회된다.**</w:t>
+            </w:r>
+          </w:p>
+          <w:p>
+            <w:pPr>
+              <w:spacing w:after="20"/>
+            </w:pPr>
+            <w:r>
+              <w:rPr>
+                <w:rFonts w:ascii="맑은 고딕" w:hAnsi="맑은 고딕" w:eastAsia="맑은 고딕"/>
+                <w:sz w:val="20"/>
+              </w:rPr>
+              <w:t>정리하면 이렇다. Standby에 붙을 수 있으면 `V$DATAGUARD_STATS`, 붙을 수 없으면 Primary의 `V$ARCHIVE_DEST_STATUS`다.</w:t>
+            </w:r>
+          </w:p>
+        </w:tc>
+      </w:tr>
+    </w:tbl>
+    <w:p/>
+    <w:p>
+      <w:r>
+        <w:rPr>
+          <w:rFonts w:ascii="맑은 고딕" w:hAnsi="맑은 고딕" w:eastAsia="맑은 고딕"/>
+          <w:sz w:val="21"/>
+        </w:rPr>
+        <w:t>Broker도 이 차이를 보여 준다. `SHOW DATABASE 'boston'`의 **`Real Time Query`가 `ON`에서 `OFF`로** 바뀌며, 구성 상태는 양쪽 모두 `SUCCESS`다. **닫는 것은 장애가 아니다.**</w:t>
+      </w:r>
+    </w:p>
+    <w:tbl>
+      <w:tblPr>
+        <w:tblStyle w:val="TableGrid"/>
+        <w:tblW w:type="auto" w:w="0"/>
+        <w:tblLook w:firstColumn="1" w:firstRow="1" w:lastColumn="0" w:lastRow="0" w:noHBand="0" w:noVBand="1" w:val="04A0"/>
+      </w:tblPr>
+      <w:tblGrid>
+        <w:gridCol w:w="8640"/>
+      </w:tblGrid>
+      <w:tr>
+        <w:tc>
+          <w:tcPr>
+            <w:tcW w:type="dxa" w:w="8640"/>
+            <w:shd w:val="clear" w:color="auto" w:fill="FFF6D5"/>
+          </w:tcPr>
+          <w:p>
+            <w:r>
+              <w:rPr>
+                <w:rFonts w:ascii="맑은 고딕" w:hAnsi="맑은 고딕" w:eastAsia="맑은 고딕"/>
+                <w:b/>
+                <w:sz w:val="21"/>
+              </w:rPr>
+              <w:t>Note · V$ARCHIVED_LOG 로 셀 때의 함정</w:t>
+            </w:r>
+          </w:p>
+          <w:p>
+            <w:pPr>
+              <w:spacing w:after="20"/>
+            </w:pPr>
+            <w:r>
+              <w:rPr>
+                <w:rFonts w:ascii="맑은 고딕" w:hAnsi="맑은 고딕" w:eastAsia="맑은 고딕"/>
+                <w:sz w:val="20"/>
+              </w:rPr>
+              <w:t>`select max(sequence#) from v$archived_log where dest_id=2 and applied='YES'`가 실측에서 **94**를 냈는데, 같은 시각 Primary의 현재 시퀀스는 **12**였다.</w:t>
+            </w:r>
+          </w:p>
+          <w:p>
+            <w:pPr>
+              <w:spacing w:after="20"/>
+            </w:pPr>
+            <w:r>
+              <w:rPr>
+                <w:rFonts w:ascii="맑은 고딕" w:hAnsi="맑은 고딕" w:eastAsia="맑은 고딕"/>
+                <w:sz w:val="20"/>
+              </w:rPr>
+              <w:t>`RESETLOGS` 뒤에도 **이전 인큐네이션의 기록이 컨트롤 파일에 남기** 때문이다. 그래서 이 절은 `APPLIED_SEQ#`를 쓴다. `V$ARCHIVED_LOG`를 쓰려면 `resetlogs_change#`로 걸러야 한다.</w:t>
+            </w:r>
+          </w:p>
+        </w:tc>
+      </w:tr>
+    </w:tbl>
+    <w:p/>
+    <w:p>
+      <w:pPr>
+        <w:pStyle w:val="Heading2"/>
+      </w:pPr>
+      <w:r>
+        <w:t>9.9  요약</w:t>
       </w:r>
     </w:p>
     <w:p>
@@ -8740,10 +9201,34 @@
     </w:p>
     <w:p>
       <w:pPr>
+        <w:pStyle w:val="ListBullet"/>
+      </w:pPr>
+      <w:r>
+        <w:rPr>
+          <w:rFonts w:ascii="맑은 고딕" w:hAnsi="맑은 고딕" w:eastAsia="맑은 고딕"/>
+          <w:sz w:val="21"/>
+        </w:rPr>
+        <w:t>옵션 없이 쓰려면 MOUNTED로 둔다. 적용은 그대로 돌고 조회만 **ORA-01219**로 막힌다. Primary 쪽 표식은 `DATABASE_MODE`와 `RECOVERY_MODE`의 **`WITH QUERY`** 유무다.</w:t>
+      </w:r>
+    </w:p>
+    <w:p>
+      <w:pPr>
+        <w:pStyle w:val="ListBullet"/>
+      </w:pPr>
+      <w:r>
+        <w:rPr>
+          <w:rFonts w:ascii="맑은 고딕" w:hAnsi="맑은 고딕" w:eastAsia="맑은 고딕"/>
+          <w:sz w:val="21"/>
+        </w:rPr>
+        <w:t>`V$DATAGUARD_STATS`는 **Primary에서 0행**이지만 **MOUNTED Standby에서는 값이 나온다.** 고정 뷰는 열지 않아도 조회되기 때문이며, 이것이 옵션 없이 지연을 재는 방법이다.</w:t>
+      </w:r>
+    </w:p>
+    <w:p>
+      <w:pPr>
         <w:pStyle w:val="Heading2"/>
       </w:pPr>
       <w:r>
-        <w:t>9.9  퀴즈</w:t>
+        <w:t>9.10  퀴즈</w:t>
       </w:r>
     </w:p>
     <w:p>
@@ -8820,10 +9305,22 @@
     </w:p>
     <w:p>
       <w:pPr>
+        <w:pStyle w:val="ListBullet"/>
+      </w:pPr>
+      <w:r>
+        <w:rPr>
+          <w:rFonts w:ascii="맑은 고딕" w:hAnsi="맑은 고딕" w:eastAsia="맑은 고딕"/>
+          <w:sz w:val="21"/>
+        </w:rPr>
+        <w:t>ADG 옵션이 없는 환경에서 동기화를 확인하는 절차를 Primary 쪽과 Standby 쪽으로 나누어 제시하라.</w:t>
+      </w:r>
+    </w:p>
+    <w:p>
+      <w:pPr>
         <w:pStyle w:val="Heading2"/>
       </w:pPr>
       <w:r>
-        <w:t>9.10  실습 개요</w:t>
+        <w:t>9.11  실습 개요</w:t>
       </w:r>
     </w:p>
     <w:p>
@@ -8911,12 +9408,24 @@
       </w:r>
     </w:p>
     <w:p>
+      <w:pPr>
+        <w:pStyle w:val="ListBullet"/>
+      </w:pPr>
       <w:r>
         <w:rPr>
           <w:rFonts w:ascii="맑은 고딕" w:hAnsi="맑은 고딕" w:eastAsia="맑은 고딕"/>
           <w:sz w:val="21"/>
         </w:rPr>
-        <w:t>실습 06·07은 적용을 멈춘다. 각 실습 끝에서 반드시 원복한다.</w:t>
+        <w:t>실습 08 — 옵션 없는 대안 경로: Standby를 MOUNTED로 내려 ORA-01219를 재현하고, Primary와 Standby 양쪽에서 동기화를 확인한 뒤 되돌린다.</w:t>
+      </w:r>
+    </w:p>
+    <w:p>
+      <w:r>
+        <w:rPr>
+          <w:rFonts w:ascii="맑은 고딕" w:hAnsi="맑은 고딕" w:eastAsia="맑은 고딕"/>
+          <w:sz w:val="21"/>
+        </w:rPr>
+        <w:t>실습 06·07은 적용을 멈추고 실습 08은 Standby를 닫는다. 각 실습 끝에서 반드시 원복한다. 실습 08은 `OPEN READ ONLY`로 되돌린 뒤 PDB까지 함께 열었는지 확인한다.</w:t>
       </w:r>
     </w:p>
     <w:sectPr>

</xml_diff>